<commit_message>
Todd's revisions to Excursion 2 and the challenge cards
Excursion: two name blanks in the header, since they may work in pairs.

Cards: each question now runs straight into its instruction, one
paragraph per card.

Co-Authored-By: Claude Opus 5 (1M context) <noreply@anthropic.com>
</commit_message>
<xml_diff>
--- a/week-2-listening-questioning/week-2-pedagogical-excursion.docx
+++ b/week-2-listening-questioning/week-2-pedagogical-excursion.docx
@@ -7,128 +7,157 @@
         <w:pStyle w:val="Heading1"/>
         <w:spacing w:before="0" w:after="0"/>
         <w:rPr>
-          <w:sz w:val="22"/>
-          <w:szCs w:val="22"/>
+          <w:sz w:val="24"/>
+          <w:szCs w:val="24"/>
         </w:rPr>
-      </w:pPr>
-      <w:r>
-        <w:rPr>
-          <w:b/>
-          <w:color w:val="1F4E96"/>
-          <w:sz w:val="22"/>
-          <w:szCs w:val="22"/>
-        </w:rPr>
-        <w:t>Pedagogical Excursion #2 — Diagnosing a Subtraction Error</w:t>
-      </w:r>
-    </w:p>
-    <w:p>
-      <w:pPr>
-        <w:pStyle w:val="Normal"/>
-        <w:spacing w:lineRule="auto" w:line="276" w:before="0" w:after="0"/>
-        <w:rPr>
-          <w:sz w:val="22"/>
-          <w:szCs w:val="22"/>
-        </w:rPr>
-      </w:pPr>
-      <w:r>
-        <w:rPr>
-          <w:b/>
-          <w:color w:val="1F4E96"/>
-          <w:sz w:val="22"/>
-          <w:szCs w:val="22"/>
-        </w:rPr>
-        <w:t>TCE 318P FA26 (Edwards)</w:t>
-      </w:r>
-    </w:p>
-    <w:p>
-      <w:pPr>
-        <w:pStyle w:val="Normal"/>
-        <w:spacing w:lineRule="auto" w:line="240" w:before="0" w:after="173"/>
-        <w:rPr>
-          <w:sz w:val="22"/>
-          <w:szCs w:val="22"/>
-        </w:rPr>
-      </w:pPr>
-      <w:r>
-        <w:rPr>
-          <w:b/>
-          <w:color w:val="1F4E96"/>
-          <w:sz w:val="22"/>
-          <w:szCs w:val="22"/>
-        </w:rPr>
-        <w:t>20 points possible</w:t>
-      </w:r>
-    </w:p>
-    <w:p>
-      <w:pPr>
-        <w:pStyle w:val="Normal"/>
-        <w:rPr/>
-      </w:pPr>
-      <w:r>
-        <w:rPr>
-          <w:b w:val="false"/>
-          <w:i/>
-        </w:rPr>
-        <w:t>In class · on your own or with a partner (no more than two). Collected at the end of the clinic.</w:t>
-      </w:r>
-    </w:p>
-    <w:p>
-      <w:pPr>
-        <w:pStyle w:val="Normal"/>
-        <w:spacing w:before="0" w:after="0"/>
-        <w:rPr/>
       </w:pPr>
       <w:r>
         <w:rPr>
           <w:b/>
           <w:color w:val="1F4E96"/>
           <w:sz w:val="24"/>
+          <w:szCs w:val="24"/>
         </w:rPr>
-        <w:t>The task the child was given</w:t>
-      </w:r>
-    </w:p>
-    <w:p>
-      <w:pPr>
-        <w:pStyle w:val="Normal"/>
-        <w:rPr/>
-      </w:pPr>
-      <w:r>
-        <w:rPr>
-          <w:b w:val="false"/>
-          <w:i w:val="false"/>
-        </w:rPr>
-        <w:t>What number is 18 less than 83?  (That is, find 83 − 18.)  Show your thinking so someone else could follow it.</w:t>
-      </w:r>
-    </w:p>
-    <w:p>
-      <w:pPr>
-        <w:pStyle w:val="Normal"/>
-        <w:spacing w:before="0" w:after="120"/>
-        <w:rPr/>
-      </w:pPr>
-      <w:r>
-        <w:rPr>
-          <w:b/>
-          <w:color w:val="1F4E96"/>
-          <w:sz w:val="24"/>
-        </w:rPr>
-        <w:t xml:space="preserve">What one </w:t>
+        <w:t>Pedagogical Excursion #2 — Diagnosing a Subtraction Error</w:t>
+        <w:tab/>
+        <w:tab/>
       </w:r>
       <w:r>
         <w:rPr>
           <w:b/>
           <w:color w:val="1F4E96"/>
           <w:sz w:val="24"/>
+          <w:szCs w:val="24"/>
         </w:rPr>
-        <w:t>student</w:t>
+        <w:t>Name: ____________________</w:t>
+      </w:r>
+    </w:p>
+    <w:p>
+      <w:pPr>
+        <w:pStyle w:val="Normal"/>
+        <w:spacing w:lineRule="auto" w:line="276" w:before="0" w:after="0"/>
+        <w:rPr>
+          <w:sz w:val="24"/>
+          <w:szCs w:val="24"/>
+        </w:rPr>
+      </w:pPr>
+      <w:r>
+        <w:rPr>
+          <w:b/>
+          <w:color w:val="1F4E96"/>
+          <w:sz w:val="24"/>
+          <w:szCs w:val="24"/>
+        </w:rPr>
+        <w:t>TCE 318P FA26 (Edwards)</w:t>
+        <w:tab/>
+        <w:tab/>
+        <w:tab/>
+        <w:tab/>
+        <w:tab/>
+        <w:tab/>
+        <w:tab/>
       </w:r>
       <w:r>
         <w:rPr>
           <w:b/>
           <w:color w:val="1F4E96"/>
           <w:sz w:val="24"/>
+          <w:szCs w:val="24"/>
         </w:rPr>
-        <w:t xml:space="preserve"> turned in:</w:t>
+        <w:t>Name: ____________________</w:t>
+      </w:r>
+    </w:p>
+    <w:p>
+      <w:pPr>
+        <w:pStyle w:val="Normal"/>
+        <w:spacing w:lineRule="auto" w:line="240" w:before="0" w:after="173"/>
+        <w:rPr>
+          <w:sz w:val="24"/>
+          <w:szCs w:val="24"/>
+        </w:rPr>
+      </w:pPr>
+      <w:r>
+        <w:rPr>
+          <w:b/>
+          <w:color w:val="1F4E96"/>
+          <w:sz w:val="24"/>
+          <w:szCs w:val="24"/>
+        </w:rPr>
+        <w:t>20 points possible</w:t>
+      </w:r>
+    </w:p>
+    <w:p>
+      <w:pPr>
+        <w:pStyle w:val="Normal"/>
+        <w:rPr>
+          <w:sz w:val="24"/>
+          <w:szCs w:val="24"/>
+        </w:rPr>
+      </w:pPr>
+      <w:r>
+        <w:rPr>
+          <w:b w:val="false"/>
+          <w:i/>
+          <w:sz w:val="24"/>
+          <w:szCs w:val="24"/>
+        </w:rPr>
+        <w:t>In class · on your own or with a partner (no more than two). Collected at the end of the clinic.</w:t>
+      </w:r>
+    </w:p>
+    <w:p>
+      <w:pPr>
+        <w:pStyle w:val="Normal"/>
+        <w:spacing w:before="0" w:after="0"/>
+        <w:rPr>
+          <w:sz w:val="24"/>
+          <w:szCs w:val="24"/>
+        </w:rPr>
+      </w:pPr>
+      <w:r>
+        <w:rPr>
+          <w:b/>
+          <w:color w:val="1F4E96"/>
+          <w:sz w:val="24"/>
+          <w:szCs w:val="24"/>
+        </w:rPr>
+        <w:t>The task the child was given</w:t>
+      </w:r>
+    </w:p>
+    <w:p>
+      <w:pPr>
+        <w:pStyle w:val="Normal"/>
+        <w:rPr>
+          <w:sz w:val="24"/>
+          <w:szCs w:val="24"/>
+        </w:rPr>
+      </w:pPr>
+      <w:r>
+        <w:rPr>
+          <w:b w:val="false"/>
+          <w:i w:val="false"/>
+          <w:sz w:val="24"/>
+          <w:szCs w:val="24"/>
+        </w:rPr>
+        <w:t>What number is 18 less than 83?  (That is, find 83 − 18.)  Show your thinking so someone else could follow it.</w:t>
+      </w:r>
+    </w:p>
+    <w:p>
+      <w:pPr>
+        <w:pStyle w:val="Normal"/>
+        <w:spacing w:before="0" w:after="120"/>
+        <w:rPr>
+          <w:sz w:val="24"/>
+          <w:szCs w:val="24"/>
+        </w:rPr>
+      </w:pPr>
+      <w:r>
+        <w:rPr>
+          <w:b/>
+          <w:color w:val="1F4E96"/>
+          <w:sz w:val="24"/>
+          <w:szCs w:val="24"/>
+        </w:rPr>
+        <w:t>What one student turned in:</w:t>
       </w:r>
     </w:p>
     <w:p>
@@ -143,11 +172,7 @@
         </w:rPr>
       </w:pPr>
       <w:r>
-        <w:rPr>
-          <w:b/>
-          <w:color w:val="1F4E96"/>
-          <w:sz w:val="24"/>
-        </w:rPr>
+        <w:rPr/>
         <w:drawing>
           <wp:inline distT="0" distB="0" distL="0" distR="0">
             <wp:extent cx="2611120" cy="2176780"/>
@@ -191,23 +216,86 @@
     <w:p>
       <w:pPr>
         <w:pStyle w:val="Normal"/>
-        <w:rPr/>
+        <w:rPr>
+          <w:sz w:val="24"/>
+          <w:szCs w:val="24"/>
+        </w:rPr>
       </w:pPr>
       <w:r>
         <w:rPr>
           <w:b/>
           <w:color w:val="1F4E96"/>
+          <w:sz w:val="24"/>
+          <w:szCs w:val="24"/>
         </w:rPr>
         <w:t xml:space="preserve">1.  </w:t>
       </w:r>
       <w:r>
-        <w:rPr/>
+        <w:rPr>
+          <w:sz w:val="24"/>
+          <w:szCs w:val="24"/>
+        </w:rPr>
         <w:t>Diagnose this student solution. What does the student seem to understand (or not) about the mathematics of the task? Justify your response with details from the student's work.</w:t>
-        <w:br/>
-        <w:br/>
-        <w:br/>
-        <w:br/>
-        <w:br/>
+      </w:r>
+    </w:p>
+    <w:p>
+      <w:pPr>
+        <w:pStyle w:val="Normal"/>
+        <w:rPr>
+          <w:sz w:val="24"/>
+          <w:szCs w:val="24"/>
+        </w:rPr>
+      </w:pPr>
+      <w:r>
+        <w:rPr>
+          <w:sz w:val="24"/>
+          <w:szCs w:val="24"/>
+        </w:rPr>
+      </w:r>
+    </w:p>
+    <w:p>
+      <w:pPr>
+        <w:pStyle w:val="Normal"/>
+        <w:rPr>
+          <w:sz w:val="24"/>
+          <w:szCs w:val="24"/>
+        </w:rPr>
+      </w:pPr>
+      <w:r>
+        <w:rPr>
+          <w:sz w:val="24"/>
+          <w:szCs w:val="24"/>
+        </w:rPr>
+      </w:r>
+    </w:p>
+    <w:p>
+      <w:pPr>
+        <w:pStyle w:val="Normal"/>
+        <w:rPr>
+          <w:sz w:val="24"/>
+          <w:szCs w:val="24"/>
+        </w:rPr>
+      </w:pPr>
+      <w:r>
+        <w:rPr>
+          <w:sz w:val="24"/>
+          <w:szCs w:val="24"/>
+        </w:rPr>
+      </w:r>
+    </w:p>
+    <w:p>
+      <w:pPr>
+        <w:pStyle w:val="Normal"/>
+        <w:rPr>
+          <w:sz w:val="24"/>
+          <w:szCs w:val="24"/>
+        </w:rPr>
+      </w:pPr>
+      <w:r>
+        <w:rPr>
+          <w:sz w:val="24"/>
+          <w:szCs w:val="24"/>
+        </w:rPr>
         <w:br/>
         <w:br/>
         <w:br/>
@@ -216,11 +304,16 @@
         <w:rPr>
           <w:b/>
           <w:color w:val="1F4E96"/>
+          <w:sz w:val="24"/>
+          <w:szCs w:val="24"/>
         </w:rPr>
         <w:t xml:space="preserve">2.  </w:t>
       </w:r>
       <w:r>
-        <w:rPr/>
+        <w:rPr>
+          <w:sz w:val="24"/>
+          <w:szCs w:val="24"/>
+        </w:rPr>
         <w:t>Write five open, non-leading questions you might ask this student to help them build a stronger understanding of the task and their solution.</w:t>
       </w:r>
     </w:p>
@@ -291,29 +384,43 @@
     <w:p>
       <w:pPr>
         <w:pStyle w:val="Normal"/>
-        <w:rPr/>
+        <w:spacing w:before="0" w:after="200"/>
+        <w:rPr>
+          <w:sz w:val="24"/>
+          <w:szCs w:val="24"/>
+        </w:rPr>
       </w:pPr>
       <w:r>
         <w:rPr>
           <w:b/>
           <w:color w:val="1F4E96"/>
+          <w:sz w:val="24"/>
+          <w:szCs w:val="24"/>
         </w:rPr>
         <w:t xml:space="preserve">3.  </w:t>
       </w:r>
       <w:r>
-        <w:rPr/>
+        <w:rPr>
+          <w:sz w:val="24"/>
+          <w:szCs w:val="24"/>
+        </w:rPr>
         <w:t>Choose the one question above that best addresses this student's learning needs. Write it here, then explain why it fits THIS child and this misconception.</w:t>
       </w:r>
     </w:p>
     <w:p>
       <w:pPr>
         <w:pStyle w:val="Normal"/>
-        <w:rPr/>
+        <w:rPr>
+          <w:sz w:val="24"/>
+          <w:szCs w:val="24"/>
+        </w:rPr>
       </w:pPr>
       <w:r>
         <w:rPr>
           <w:b/>
           <w:i w:val="false"/>
+          <w:sz w:val="24"/>
+          <w:szCs w:val="24"/>
         </w:rPr>
         <w:t>Chosen question:</w:t>
       </w:r>
@@ -321,34 +428,47 @@
     <w:p>
       <w:pPr>
         <w:pStyle w:val="Normal"/>
-        <w:rPr/>
+        <w:rPr>
+          <w:sz w:val="24"/>
+          <w:szCs w:val="24"/>
+        </w:rPr>
       </w:pPr>
       <w:r>
-        <w:rPr/>
+        <w:rPr>
+          <w:sz w:val="24"/>
+          <w:szCs w:val="24"/>
+        </w:rPr>
       </w:r>
     </w:p>
     <w:p>
       <w:pPr>
         <w:pStyle w:val="Normal"/>
-        <w:rPr/>
+        <w:rPr>
+          <w:sz w:val="24"/>
+          <w:szCs w:val="24"/>
+        </w:rPr>
       </w:pPr>
       <w:r>
-        <w:rPr/>
+        <w:rPr>
+          <w:sz w:val="24"/>
+          <w:szCs w:val="24"/>
+        </w:rPr>
       </w:r>
     </w:p>
     <w:p>
       <w:pPr>
         <w:pStyle w:val="Normal"/>
         <w:rPr>
-          <w:rFonts w:ascii="Calibri" w:hAnsi="Calibri"/>
-          <w:b/>
-          <w:i w:val="false"/>
+          <w:sz w:val="24"/>
+          <w:szCs w:val="24"/>
         </w:rPr>
       </w:pPr>
       <w:r>
         <w:rPr>
           <w:b/>
           <w:i w:val="false"/>
+          <w:sz w:val="24"/>
+          <w:szCs w:val="24"/>
         </w:rPr>
         <w:t>Why it fits this child (3–5 sentences):</w:t>
       </w:r>
@@ -362,6 +482,7 @@
           <w:i w:val="false"/>
           <w:color w:val="1F4E96"/>
           <w:sz w:val="24"/>
+          <w:szCs w:val="24"/>
         </w:rPr>
       </w:pPr>
       <w:r>
@@ -370,6 +491,7 @@
           <w:i w:val="false"/>
           <w:color w:val="1F4E96"/>
           <w:sz w:val="24"/>
+          <w:szCs w:val="24"/>
         </w:rPr>
       </w:r>
     </w:p>
@@ -703,14 +825,12 @@
             <w:pPr>
               <w:pStyle w:val="Normal"/>
               <w:widowControl/>
+              <w:suppressAutoHyphens w:val="true"/>
               <w:spacing w:lineRule="auto" w:line="240" w:before="0" w:after="0"/>
               <w:jc w:val="start"/>
               <w:rPr>
-                <w:rFonts w:eastAsia="ＭＳ 明朝"/>
-                <w:kern w:val="0"/>
-                <w:sz w:val="22"/>
-                <w:szCs w:val="22"/>
-                <w:lang w:val="en-US" w:eastAsia="en-US" w:bidi="ar-SA"/>
+                <w:sz w:val="24"/>
+                <w:szCs w:val="24"/>
               </w:rPr>
             </w:pPr>
             <w:r>
@@ -720,8 +840,8 @@
                 <w:i w:val="false"/>
                 <w:color w:val="FFFFFF"/>
                 <w:kern w:val="0"/>
-                <w:sz w:val="22"/>
-                <w:szCs w:val="22"/>
+                <w:sz w:val="24"/>
+                <w:szCs w:val="24"/>
                 <w:lang w:val="en-US" w:eastAsia="en-US" w:bidi="ar-SA"/>
               </w:rPr>
               <w:t>Criteria</w:t>
@@ -738,14 +858,12 @@
             <w:pPr>
               <w:pStyle w:val="Normal"/>
               <w:widowControl/>
+              <w:suppressAutoHyphens w:val="true"/>
               <w:spacing w:lineRule="auto" w:line="240" w:before="0" w:after="0"/>
               <w:jc w:val="start"/>
               <w:rPr>
-                <w:rFonts w:eastAsia="ＭＳ 明朝"/>
-                <w:kern w:val="0"/>
-                <w:sz w:val="22"/>
-                <w:szCs w:val="22"/>
-                <w:lang w:val="en-US" w:eastAsia="en-US" w:bidi="ar-SA"/>
+                <w:sz w:val="24"/>
+                <w:szCs w:val="24"/>
               </w:rPr>
             </w:pPr>
             <w:r>
@@ -755,8 +873,8 @@
                 <w:i w:val="false"/>
                 <w:color w:val="FFFFFF"/>
                 <w:kern w:val="0"/>
-                <w:sz w:val="22"/>
-                <w:szCs w:val="22"/>
+                <w:sz w:val="24"/>
+                <w:szCs w:val="24"/>
                 <w:lang w:val="en-US" w:eastAsia="en-US" w:bidi="ar-SA"/>
               </w:rPr>
               <w:t>Expectations</w:t>
@@ -775,14 +893,12 @@
             <w:pPr>
               <w:pStyle w:val="Normal"/>
               <w:widowControl/>
+              <w:suppressAutoHyphens w:val="true"/>
               <w:spacing w:lineRule="auto" w:line="240" w:before="0" w:after="0"/>
               <w:jc w:val="start"/>
               <w:rPr>
-                <w:rFonts w:eastAsia="ＭＳ 明朝"/>
-                <w:kern w:val="0"/>
-                <w:sz w:val="22"/>
-                <w:szCs w:val="22"/>
-                <w:lang w:val="en-US" w:eastAsia="en-US" w:bidi="ar-SA"/>
+                <w:sz w:val="24"/>
+                <w:szCs w:val="24"/>
               </w:rPr>
             </w:pPr>
             <w:r>
@@ -792,8 +908,8 @@
                 <w:i w:val="false"/>
                 <w:color w:val="1F4E96"/>
                 <w:kern w:val="0"/>
-                <w:sz w:val="22"/>
-                <w:szCs w:val="22"/>
+                <w:sz w:val="24"/>
+                <w:szCs w:val="24"/>
                 <w:lang w:val="en-US" w:eastAsia="en-US" w:bidi="ar-SA"/>
               </w:rPr>
               <w:t>Diagnosis (5)</w:t>
@@ -809,14 +925,12 @@
             <w:pPr>
               <w:pStyle w:val="Normal"/>
               <w:widowControl/>
+              <w:suppressAutoHyphens w:val="true"/>
               <w:spacing w:lineRule="auto" w:line="240" w:before="0" w:after="0"/>
               <w:jc w:val="start"/>
               <w:rPr>
-                <w:rFonts w:eastAsia="ＭＳ 明朝"/>
-                <w:kern w:val="0"/>
-                <w:sz w:val="22"/>
-                <w:szCs w:val="22"/>
-                <w:lang w:val="en-US" w:eastAsia="en-US" w:bidi="ar-SA"/>
+                <w:sz w:val="24"/>
+                <w:szCs w:val="24"/>
               </w:rPr>
             </w:pPr>
             <w:r>
@@ -825,8 +939,8 @@
                 <w:b w:val="false"/>
                 <w:i w:val="false"/>
                 <w:kern w:val="0"/>
-                <w:sz w:val="22"/>
-                <w:szCs w:val="22"/>
+                <w:sz w:val="24"/>
+                <w:szCs w:val="24"/>
                 <w:lang w:val="en-US" w:eastAsia="en-US" w:bidi="ar-SA"/>
               </w:rPr>
               <w:t>Names what the child understands and the misconception, at the place-value root — grounded in specific details from the work.</w:t>
@@ -845,14 +959,12 @@
             <w:pPr>
               <w:pStyle w:val="Normal"/>
               <w:widowControl/>
+              <w:suppressAutoHyphens w:val="true"/>
               <w:spacing w:lineRule="auto" w:line="240" w:before="0" w:after="0"/>
               <w:jc w:val="start"/>
               <w:rPr>
-                <w:rFonts w:eastAsia="ＭＳ 明朝"/>
-                <w:kern w:val="0"/>
-                <w:sz w:val="22"/>
-                <w:szCs w:val="22"/>
-                <w:lang w:val="en-US" w:eastAsia="en-US" w:bidi="ar-SA"/>
+                <w:sz w:val="24"/>
+                <w:szCs w:val="24"/>
               </w:rPr>
             </w:pPr>
             <w:r>
@@ -862,8 +974,8 @@
                 <w:i w:val="false"/>
                 <w:color w:val="1F4E96"/>
                 <w:kern w:val="0"/>
-                <w:sz w:val="22"/>
-                <w:szCs w:val="22"/>
+                <w:sz w:val="24"/>
+                <w:szCs w:val="24"/>
                 <w:lang w:val="en-US" w:eastAsia="en-US" w:bidi="ar-SA"/>
               </w:rPr>
               <w:t>Questions (5 — 1 pt each)</w:t>
@@ -879,14 +991,12 @@
             <w:pPr>
               <w:pStyle w:val="Normal"/>
               <w:widowControl/>
+              <w:suppressAutoHyphens w:val="true"/>
               <w:spacing w:lineRule="auto" w:line="240" w:before="0" w:after="0"/>
               <w:jc w:val="start"/>
               <w:rPr>
-                <w:rFonts w:eastAsia="ＭＳ 明朝"/>
-                <w:kern w:val="0"/>
-                <w:sz w:val="22"/>
-                <w:szCs w:val="22"/>
-                <w:lang w:val="en-US" w:eastAsia="en-US" w:bidi="ar-SA"/>
+                <w:sz w:val="24"/>
+                <w:szCs w:val="24"/>
               </w:rPr>
             </w:pPr>
             <w:r>
@@ -895,8 +1005,8 @@
                 <w:b w:val="false"/>
                 <w:i w:val="false"/>
                 <w:kern w:val="0"/>
-                <w:sz w:val="22"/>
-                <w:szCs w:val="22"/>
+                <w:sz w:val="24"/>
+                <w:szCs w:val="24"/>
                 <w:lang w:val="en-US" w:eastAsia="en-US" w:bidi="ar-SA"/>
               </w:rPr>
               <w:t>Five open, non-leading questions — not telling, hinting, or funneling the answer.</w:t>
@@ -915,14 +1025,12 @@
             <w:pPr>
               <w:pStyle w:val="Normal"/>
               <w:widowControl/>
+              <w:suppressAutoHyphens w:val="true"/>
               <w:spacing w:lineRule="auto" w:line="240" w:before="0" w:after="0"/>
               <w:jc w:val="start"/>
               <w:rPr>
-                <w:rFonts w:eastAsia="ＭＳ 明朝"/>
-                <w:kern w:val="0"/>
-                <w:sz w:val="22"/>
-                <w:szCs w:val="22"/>
-                <w:lang w:val="en-US" w:eastAsia="en-US" w:bidi="ar-SA"/>
+                <w:sz w:val="24"/>
+                <w:szCs w:val="24"/>
               </w:rPr>
             </w:pPr>
             <w:r>
@@ -932,8 +1040,8 @@
                 <w:i w:val="false"/>
                 <w:color w:val="1F4E96"/>
                 <w:kern w:val="0"/>
-                <w:sz w:val="22"/>
-                <w:szCs w:val="22"/>
+                <w:sz w:val="24"/>
+                <w:szCs w:val="24"/>
                 <w:lang w:val="en-US" w:eastAsia="en-US" w:bidi="ar-SA"/>
               </w:rPr>
               <w:t>Rationale for your chosen question (10)</w:t>
@@ -949,14 +1057,12 @@
             <w:pPr>
               <w:pStyle w:val="Normal"/>
               <w:widowControl/>
+              <w:suppressAutoHyphens w:val="true"/>
               <w:spacing w:lineRule="auto" w:line="240" w:before="0" w:after="0"/>
               <w:jc w:val="start"/>
               <w:rPr>
-                <w:rFonts w:eastAsia="ＭＳ 明朝"/>
-                <w:kern w:val="0"/>
-                <w:sz w:val="22"/>
-                <w:szCs w:val="22"/>
-                <w:lang w:val="en-US" w:eastAsia="en-US" w:bidi="ar-SA"/>
+                <w:sz w:val="24"/>
+                <w:szCs w:val="24"/>
               </w:rPr>
             </w:pPr>
             <w:r>
@@ -965,8 +1071,8 @@
                 <w:b w:val="false"/>
                 <w:i w:val="false"/>
                 <w:kern w:val="0"/>
-                <w:sz w:val="22"/>
-                <w:szCs w:val="22"/>
+                <w:sz w:val="24"/>
+                <w:szCs w:val="24"/>
                 <w:lang w:val="en-US" w:eastAsia="en-US" w:bidi="ar-SA"/>
               </w:rPr>
               <w:t>Why this question fits THIS child and THIS misconception — specific to the context, not a general prompt. ("What are you thinking?" is too vague.) Cite details from this week's readings in your response.</w:t>
@@ -1017,6 +1123,7 @@
         </w:tabs>
         <w:ind w:start="1080" w:hanging="360"/>
       </w:pPr>
+      <w:rPr/>
     </w:lvl>
     <w:lvl w:ilvl="2">
       <w:start w:val="1"/>
@@ -1029,6 +1136,7 @@
         </w:tabs>
         <w:ind w:start="1440" w:hanging="360"/>
       </w:pPr>
+      <w:rPr/>
     </w:lvl>
     <w:lvl w:ilvl="3">
       <w:start w:val="1"/>
@@ -1041,6 +1149,7 @@
         </w:tabs>
         <w:ind w:start="1800" w:hanging="360"/>
       </w:pPr>
+      <w:rPr/>
     </w:lvl>
     <w:lvl w:ilvl="4">
       <w:start w:val="1"/>
@@ -1053,6 +1162,7 @@
         </w:tabs>
         <w:ind w:start="2160" w:hanging="360"/>
       </w:pPr>
+      <w:rPr/>
     </w:lvl>
     <w:lvl w:ilvl="5">
       <w:start w:val="1"/>
@@ -1065,6 +1175,7 @@
         </w:tabs>
         <w:ind w:start="2520" w:hanging="360"/>
       </w:pPr>
+      <w:rPr/>
     </w:lvl>
     <w:lvl w:ilvl="6">
       <w:start w:val="1"/>
@@ -1077,6 +1188,7 @@
         </w:tabs>
         <w:ind w:start="2880" w:hanging="360"/>
       </w:pPr>
+      <w:rPr/>
     </w:lvl>
     <w:lvl w:ilvl="7">
       <w:start w:val="1"/>
@@ -1089,6 +1201,7 @@
         </w:tabs>
         <w:ind w:start="3240" w:hanging="360"/>
       </w:pPr>
+      <w:rPr/>
     </w:lvl>
     <w:lvl w:ilvl="8">
       <w:start w:val="1"/>
@@ -1101,6 +1214,7 @@
         </w:tabs>
         <w:ind w:start="3600" w:hanging="360"/>
       </w:pPr>
+      <w:rPr/>
     </w:lvl>
   </w:abstractNum>
   <w:abstractNum w:abstractNumId="2">
@@ -1130,6 +1244,7 @@
         </w:tabs>
         <w:ind w:start="1080" w:hanging="360"/>
       </w:pPr>
+      <w:rPr/>
     </w:lvl>
     <w:lvl w:ilvl="2">
       <w:start w:val="1"/>
@@ -1142,6 +1257,7 @@
         </w:tabs>
         <w:ind w:start="1440" w:hanging="360"/>
       </w:pPr>
+      <w:rPr/>
     </w:lvl>
     <w:lvl w:ilvl="3">
       <w:start w:val="1"/>
@@ -1154,6 +1270,7 @@
         </w:tabs>
         <w:ind w:start="1800" w:hanging="360"/>
       </w:pPr>
+      <w:rPr/>
     </w:lvl>
     <w:lvl w:ilvl="4">
       <w:start w:val="1"/>
@@ -1166,6 +1283,7 @@
         </w:tabs>
         <w:ind w:start="2160" w:hanging="360"/>
       </w:pPr>
+      <w:rPr/>
     </w:lvl>
     <w:lvl w:ilvl="5">
       <w:start w:val="1"/>
@@ -1178,6 +1296,7 @@
         </w:tabs>
         <w:ind w:start="2520" w:hanging="360"/>
       </w:pPr>
+      <w:rPr/>
     </w:lvl>
     <w:lvl w:ilvl="6">
       <w:start w:val="1"/>
@@ -1190,6 +1309,7 @@
         </w:tabs>
         <w:ind w:start="2880" w:hanging="360"/>
       </w:pPr>
+      <w:rPr/>
     </w:lvl>
     <w:lvl w:ilvl="7">
       <w:start w:val="1"/>
@@ -1202,6 +1322,7 @@
         </w:tabs>
         <w:ind w:start="3240" w:hanging="360"/>
       </w:pPr>
+      <w:rPr/>
     </w:lvl>
     <w:lvl w:ilvl="8">
       <w:start w:val="1"/>
@@ -1214,6 +1335,7 @@
         </w:tabs>
         <w:ind w:start="3600" w:hanging="360"/>
       </w:pPr>
+      <w:rPr/>
     </w:lvl>
   </w:abstractNum>
   <w:abstractNum w:abstractNumId="3">
@@ -1243,6 +1365,7 @@
         </w:tabs>
         <w:ind w:start="1080" w:hanging="360"/>
       </w:pPr>
+      <w:rPr/>
     </w:lvl>
     <w:lvl w:ilvl="2">
       <w:start w:val="1"/>
@@ -1255,6 +1378,7 @@
         </w:tabs>
         <w:ind w:start="1440" w:hanging="360"/>
       </w:pPr>
+      <w:rPr/>
     </w:lvl>
     <w:lvl w:ilvl="3">
       <w:start w:val="1"/>
@@ -1267,6 +1391,7 @@
         </w:tabs>
         <w:ind w:start="1800" w:hanging="360"/>
       </w:pPr>
+      <w:rPr/>
     </w:lvl>
     <w:lvl w:ilvl="4">
       <w:start w:val="1"/>
@@ -1279,6 +1404,7 @@
         </w:tabs>
         <w:ind w:start="2160" w:hanging="360"/>
       </w:pPr>
+      <w:rPr/>
     </w:lvl>
     <w:lvl w:ilvl="5">
       <w:start w:val="1"/>
@@ -1291,6 +1417,7 @@
         </w:tabs>
         <w:ind w:start="2520" w:hanging="360"/>
       </w:pPr>
+      <w:rPr/>
     </w:lvl>
     <w:lvl w:ilvl="6">
       <w:start w:val="1"/>
@@ -1303,6 +1430,7 @@
         </w:tabs>
         <w:ind w:start="2880" w:hanging="360"/>
       </w:pPr>
+      <w:rPr/>
     </w:lvl>
     <w:lvl w:ilvl="7">
       <w:start w:val="1"/>
@@ -1315,6 +1443,7 @@
         </w:tabs>
         <w:ind w:start="3240" w:hanging="360"/>
       </w:pPr>
+      <w:rPr/>
     </w:lvl>
     <w:lvl w:ilvl="8">
       <w:start w:val="1"/>
@@ -1327,6 +1456,7 @@
         </w:tabs>
         <w:ind w:start="3600" w:hanging="360"/>
       </w:pPr>
+      <w:rPr/>
     </w:lvl>
   </w:abstractNum>
   <w:abstractNum w:abstractNumId="4">
@@ -1354,6 +1484,7 @@
         </w:tabs>
         <w:ind w:start="1080" w:hanging="360"/>
       </w:pPr>
+      <w:rPr/>
     </w:lvl>
     <w:lvl w:ilvl="2">
       <w:start w:val="1"/>
@@ -1366,6 +1497,7 @@
         </w:tabs>
         <w:ind w:start="1440" w:hanging="360"/>
       </w:pPr>
+      <w:rPr/>
     </w:lvl>
     <w:lvl w:ilvl="3">
       <w:start w:val="1"/>
@@ -1378,6 +1510,7 @@
         </w:tabs>
         <w:ind w:start="1800" w:hanging="360"/>
       </w:pPr>
+      <w:rPr/>
     </w:lvl>
     <w:lvl w:ilvl="4">
       <w:start w:val="1"/>
@@ -1390,6 +1523,7 @@
         </w:tabs>
         <w:ind w:start="2160" w:hanging="360"/>
       </w:pPr>
+      <w:rPr/>
     </w:lvl>
     <w:lvl w:ilvl="5">
       <w:start w:val="1"/>
@@ -1402,6 +1536,7 @@
         </w:tabs>
         <w:ind w:start="2520" w:hanging="360"/>
       </w:pPr>
+      <w:rPr/>
     </w:lvl>
     <w:lvl w:ilvl="6">
       <w:start w:val="1"/>
@@ -1414,6 +1549,7 @@
         </w:tabs>
         <w:ind w:start="2880" w:hanging="360"/>
       </w:pPr>
+      <w:rPr/>
     </w:lvl>
     <w:lvl w:ilvl="7">
       <w:start w:val="1"/>
@@ -1426,6 +1562,7 @@
         </w:tabs>
         <w:ind w:start="3240" w:hanging="360"/>
       </w:pPr>
+      <w:rPr/>
     </w:lvl>
     <w:lvl w:ilvl="8">
       <w:start w:val="1"/>
@@ -1438,6 +1575,7 @@
         </w:tabs>
         <w:ind w:start="3600" w:hanging="360"/>
       </w:pPr>
+      <w:rPr/>
     </w:lvl>
   </w:abstractNum>
   <w:abstractNum w:abstractNumId="5">
@@ -1465,6 +1603,7 @@
         </w:tabs>
         <w:ind w:start="1080" w:hanging="360"/>
       </w:pPr>
+      <w:rPr/>
     </w:lvl>
     <w:lvl w:ilvl="2">
       <w:start w:val="1"/>
@@ -1477,6 +1616,7 @@
         </w:tabs>
         <w:ind w:start="1440" w:hanging="360"/>
       </w:pPr>
+      <w:rPr/>
     </w:lvl>
     <w:lvl w:ilvl="3">
       <w:start w:val="1"/>
@@ -1489,6 +1629,7 @@
         </w:tabs>
         <w:ind w:start="1800" w:hanging="360"/>
       </w:pPr>
+      <w:rPr/>
     </w:lvl>
     <w:lvl w:ilvl="4">
       <w:start w:val="1"/>
@@ -1501,6 +1642,7 @@
         </w:tabs>
         <w:ind w:start="2160" w:hanging="360"/>
       </w:pPr>
+      <w:rPr/>
     </w:lvl>
     <w:lvl w:ilvl="5">
       <w:start w:val="1"/>
@@ -1513,6 +1655,7 @@
         </w:tabs>
         <w:ind w:start="2520" w:hanging="360"/>
       </w:pPr>
+      <w:rPr/>
     </w:lvl>
     <w:lvl w:ilvl="6">
       <w:start w:val="1"/>
@@ -1525,6 +1668,7 @@
         </w:tabs>
         <w:ind w:start="2880" w:hanging="360"/>
       </w:pPr>
+      <w:rPr/>
     </w:lvl>
     <w:lvl w:ilvl="7">
       <w:start w:val="1"/>
@@ -1537,6 +1681,7 @@
         </w:tabs>
         <w:ind w:start="3240" w:hanging="360"/>
       </w:pPr>
+      <w:rPr/>
     </w:lvl>
     <w:lvl w:ilvl="8">
       <w:start w:val="1"/>
@@ -1549,6 +1694,7 @@
         </w:tabs>
         <w:ind w:start="3600" w:hanging="360"/>
       </w:pPr>
+      <w:rPr/>
     </w:lvl>
   </w:abstractNum>
   <w:abstractNum w:abstractNumId="6">
@@ -1576,6 +1722,7 @@
         </w:tabs>
         <w:ind w:start="1080" w:hanging="360"/>
       </w:pPr>
+      <w:rPr/>
     </w:lvl>
     <w:lvl w:ilvl="2">
       <w:start w:val="1"/>
@@ -1588,6 +1735,7 @@
         </w:tabs>
         <w:ind w:start="1440" w:hanging="360"/>
       </w:pPr>
+      <w:rPr/>
     </w:lvl>
     <w:lvl w:ilvl="3">
       <w:start w:val="1"/>
@@ -1600,6 +1748,7 @@
         </w:tabs>
         <w:ind w:start="1800" w:hanging="360"/>
       </w:pPr>
+      <w:rPr/>
     </w:lvl>
     <w:lvl w:ilvl="4">
       <w:start w:val="1"/>
@@ -1612,6 +1761,7 @@
         </w:tabs>
         <w:ind w:start="2160" w:hanging="360"/>
       </w:pPr>
+      <w:rPr/>
     </w:lvl>
     <w:lvl w:ilvl="5">
       <w:start w:val="1"/>
@@ -1624,6 +1774,7 @@
         </w:tabs>
         <w:ind w:start="2520" w:hanging="360"/>
       </w:pPr>
+      <w:rPr/>
     </w:lvl>
     <w:lvl w:ilvl="6">
       <w:start w:val="1"/>
@@ -1636,6 +1787,7 @@
         </w:tabs>
         <w:ind w:start="2880" w:hanging="360"/>
       </w:pPr>
+      <w:rPr/>
     </w:lvl>
     <w:lvl w:ilvl="7">
       <w:start w:val="1"/>
@@ -1648,6 +1800,7 @@
         </w:tabs>
         <w:ind w:start="3240" w:hanging="360"/>
       </w:pPr>
+      <w:rPr/>
     </w:lvl>
     <w:lvl w:ilvl="8">
       <w:start w:val="1"/>
@@ -1660,6 +1813,7 @@
         </w:tabs>
         <w:ind w:start="3600" w:hanging="360"/>
       </w:pPr>
+      <w:rPr/>
     </w:lvl>
   </w:abstractNum>
   <w:abstractNum w:abstractNumId="7">
@@ -1810,7 +1964,7 @@
   <w:docDefaults>
     <w:rPrDefault>
       <w:rPr>
-        <w:rFonts w:ascii="Cambria" w:hAnsi="Cambria" w:eastAsia="ＭＳ 明朝" w:cs="" w:asciiTheme="minorHAnsi" w:cstheme="minorBidi" w:eastAsiaTheme="minorEastAsia" w:hAnsiTheme="minorHAnsi"/>
+        <w:rFonts w:ascii="Cambria" w:hAnsi="Cambria" w:eastAsia="" w:cs="" w:asciiTheme="minorHAnsi" w:cstheme="minorBidi" w:eastAsiaTheme="minorEastAsia" w:hAnsiTheme="minorHAnsi"/>
         <w:sz w:val="22"/>
         <w:szCs w:val="22"/>
         <w:lang w:val="en-US" w:eastAsia="en-US" w:bidi="ar-SA"/>
@@ -1967,12 +2121,13 @@
     <w:rsid w:val="00fc693f"/>
     <w:pPr>
       <w:widowControl/>
+      <w:suppressAutoHyphens w:val="true"/>
       <w:bidi w:val="0"/>
       <w:spacing w:lineRule="auto" w:line="276" w:before="0" w:after="200"/>
       <w:jc w:val="start"/>
     </w:pPr>
     <w:rPr>
-      <w:rFonts w:ascii="Calibri" w:hAnsi="Calibri" w:cs="Calibri" w:eastAsia="ＭＳ 明朝" w:eastAsiaTheme="minorEastAsia"/>
+      <w:rFonts w:ascii="Calibri" w:hAnsi="Calibri" w:eastAsia="" w:cs="Calibri" w:eastAsiaTheme="minorEastAsia"/>
       <w:color w:val="auto"/>
       <w:kern w:val="0"/>
       <w:sz w:val="22"/>
@@ -1995,7 +2150,7 @@
       <w:outlineLvl w:val="0"/>
     </w:pPr>
     <w:rPr>
-      <w:rFonts w:ascii="Calibri" w:hAnsi="Calibri" w:eastAsia="ＭＳ ゴシック" w:cs="" w:asciiTheme="majorHAnsi" w:cstheme="majorBidi" w:eastAsiaTheme="majorEastAsia" w:hAnsiTheme="majorHAnsi"/>
+      <w:rFonts w:ascii="Calibri" w:hAnsi="Calibri" w:eastAsia="" w:cs="" w:asciiTheme="majorHAnsi" w:cstheme="majorBidi" w:eastAsiaTheme="majorEastAsia" w:hAnsiTheme="majorHAnsi"/>
       <w:b/>
       <w:bCs/>
       <w:color w:themeColor="accent1" w:themeShade="bf" w:val="365F91"/>
@@ -2019,7 +2174,7 @@
       <w:outlineLvl w:val="1"/>
     </w:pPr>
     <w:rPr>
-      <w:rFonts w:ascii="Calibri" w:hAnsi="Calibri" w:eastAsia="ＭＳ ゴシック" w:cs="" w:asciiTheme="majorHAnsi" w:cstheme="majorBidi" w:eastAsiaTheme="majorEastAsia" w:hAnsiTheme="majorHAnsi"/>
+      <w:rFonts w:ascii="Calibri" w:hAnsi="Calibri" w:eastAsia="" w:cs="" w:asciiTheme="majorHAnsi" w:cstheme="majorBidi" w:eastAsiaTheme="majorEastAsia" w:hAnsiTheme="majorHAnsi"/>
       <w:b/>
       <w:bCs/>
       <w:color w:themeColor="accent1" w:val="4F81BD"/>
@@ -2043,7 +2198,7 @@
       <w:outlineLvl w:val="2"/>
     </w:pPr>
     <w:rPr>
-      <w:rFonts w:ascii="Calibri" w:hAnsi="Calibri" w:eastAsia="ＭＳ ゴシック" w:cs="" w:asciiTheme="majorHAnsi" w:cstheme="majorBidi" w:eastAsiaTheme="majorEastAsia" w:hAnsiTheme="majorHAnsi"/>
+      <w:rFonts w:ascii="Calibri" w:hAnsi="Calibri" w:eastAsia="" w:cs="" w:asciiTheme="majorHAnsi" w:cstheme="majorBidi" w:eastAsiaTheme="majorEastAsia" w:hAnsiTheme="majorHAnsi"/>
       <w:b/>
       <w:bCs/>
       <w:color w:themeColor="accent1" w:val="4F81BD"/>
@@ -2066,7 +2221,7 @@
       <w:outlineLvl w:val="3"/>
     </w:pPr>
     <w:rPr>
-      <w:rFonts w:ascii="Calibri" w:hAnsi="Calibri" w:eastAsia="ＭＳ ゴシック" w:cs="" w:asciiTheme="majorHAnsi" w:cstheme="majorBidi" w:eastAsiaTheme="majorEastAsia" w:hAnsiTheme="majorHAnsi"/>
+      <w:rFonts w:ascii="Calibri" w:hAnsi="Calibri" w:eastAsia="" w:cs="" w:asciiTheme="majorHAnsi" w:cstheme="majorBidi" w:eastAsiaTheme="majorEastAsia" w:hAnsiTheme="majorHAnsi"/>
       <w:b/>
       <w:bCs/>
       <w:i/>
@@ -2091,7 +2246,7 @@
       <w:outlineLvl w:val="4"/>
     </w:pPr>
     <w:rPr>
-      <w:rFonts w:ascii="Calibri" w:hAnsi="Calibri" w:eastAsia="ＭＳ ゴシック" w:cs="" w:asciiTheme="majorHAnsi" w:cstheme="majorBidi" w:eastAsiaTheme="majorEastAsia" w:hAnsiTheme="majorHAnsi"/>
+      <w:rFonts w:ascii="Calibri" w:hAnsi="Calibri" w:eastAsia="" w:cs="" w:asciiTheme="majorHAnsi" w:cstheme="majorBidi" w:eastAsiaTheme="majorEastAsia" w:hAnsiTheme="majorHAnsi"/>
       <w:color w:themeColor="accent1" w:themeShade="7f" w:val="243F60"/>
     </w:rPr>
   </w:style>
@@ -2112,7 +2267,7 @@
       <w:outlineLvl w:val="5"/>
     </w:pPr>
     <w:rPr>
-      <w:rFonts w:ascii="Calibri" w:hAnsi="Calibri" w:eastAsia="ＭＳ ゴシック" w:cs="" w:asciiTheme="majorHAnsi" w:cstheme="majorBidi" w:eastAsiaTheme="majorEastAsia" w:hAnsiTheme="majorHAnsi"/>
+      <w:rFonts w:ascii="Calibri" w:hAnsi="Calibri" w:eastAsia="" w:cs="" w:asciiTheme="majorHAnsi" w:cstheme="majorBidi" w:eastAsiaTheme="majorEastAsia" w:hAnsiTheme="majorHAnsi"/>
       <w:i/>
       <w:iCs/>
       <w:color w:themeColor="accent1" w:themeShade="7f" w:val="243F60"/>
@@ -2135,7 +2290,7 @@
       <w:outlineLvl w:val="6"/>
     </w:pPr>
     <w:rPr>
-      <w:rFonts w:ascii="Calibri" w:hAnsi="Calibri" w:eastAsia="ＭＳ ゴシック" w:cs="" w:asciiTheme="majorHAnsi" w:cstheme="majorBidi" w:eastAsiaTheme="majorEastAsia" w:hAnsiTheme="majorHAnsi"/>
+      <w:rFonts w:ascii="Calibri" w:hAnsi="Calibri" w:eastAsia="" w:cs="" w:asciiTheme="majorHAnsi" w:cstheme="majorBidi" w:eastAsiaTheme="majorEastAsia" w:hAnsiTheme="majorHAnsi"/>
       <w:i/>
       <w:iCs/>
       <w:color w:themeColor="text1" w:themeTint="bf" w:val="404040"/>
@@ -2158,7 +2313,7 @@
       <w:outlineLvl w:val="7"/>
     </w:pPr>
     <w:rPr>
-      <w:rFonts w:ascii="Calibri" w:hAnsi="Calibri" w:eastAsia="ＭＳ ゴシック" w:cs="" w:asciiTheme="majorHAnsi" w:cstheme="majorBidi" w:eastAsiaTheme="majorEastAsia" w:hAnsiTheme="majorHAnsi"/>
+      <w:rFonts w:ascii="Calibri" w:hAnsi="Calibri" w:eastAsia="" w:cs="" w:asciiTheme="majorHAnsi" w:cstheme="majorBidi" w:eastAsiaTheme="majorEastAsia" w:hAnsiTheme="majorHAnsi"/>
       <w:color w:themeColor="accent1" w:val="4F81BD"/>
       <w:sz w:val="20"/>
       <w:szCs w:val="20"/>
@@ -2181,7 +2336,7 @@
       <w:outlineLvl w:val="8"/>
     </w:pPr>
     <w:rPr>
-      <w:rFonts w:ascii="Calibri" w:hAnsi="Calibri" w:eastAsia="ＭＳ ゴシック" w:cs="" w:asciiTheme="majorHAnsi" w:cstheme="majorBidi" w:eastAsiaTheme="majorEastAsia" w:hAnsiTheme="majorHAnsi"/>
+      <w:rFonts w:ascii="Calibri" w:hAnsi="Calibri" w:eastAsia="" w:cs="" w:asciiTheme="majorHAnsi" w:cstheme="majorBidi" w:eastAsiaTheme="majorEastAsia" w:hAnsiTheme="majorHAnsi"/>
       <w:i/>
       <w:iCs/>
       <w:color w:themeColor="text1" w:themeTint="bf" w:val="404040"/>
@@ -2223,7 +2378,7 @@
     <w:qFormat/>
     <w:rsid w:val="00fc693f"/>
     <w:rPr>
-      <w:rFonts w:ascii="Calibri" w:hAnsi="Calibri" w:eastAsia="ＭＳ ゴシック" w:cs="" w:asciiTheme="majorHAnsi" w:cstheme="majorBidi" w:eastAsiaTheme="majorEastAsia" w:hAnsiTheme="majorHAnsi"/>
+      <w:rFonts w:ascii="Calibri" w:hAnsi="Calibri" w:eastAsia="" w:cs="" w:asciiTheme="majorHAnsi" w:cstheme="majorBidi" w:eastAsiaTheme="majorEastAsia" w:hAnsiTheme="majorHAnsi"/>
       <w:b/>
       <w:bCs/>
       <w:color w:themeColor="accent1" w:themeShade="bf" w:val="365F91"/>
@@ -2239,7 +2394,7 @@
     <w:qFormat/>
     <w:rsid w:val="00fc693f"/>
     <w:rPr>
-      <w:rFonts w:ascii="Calibri" w:hAnsi="Calibri" w:eastAsia="ＭＳ ゴシック" w:cs="" w:asciiTheme="majorHAnsi" w:cstheme="majorBidi" w:eastAsiaTheme="majorEastAsia" w:hAnsiTheme="majorHAnsi"/>
+      <w:rFonts w:ascii="Calibri" w:hAnsi="Calibri" w:eastAsia="" w:cs="" w:asciiTheme="majorHAnsi" w:cstheme="majorBidi" w:eastAsiaTheme="majorEastAsia" w:hAnsiTheme="majorHAnsi"/>
       <w:b/>
       <w:bCs/>
       <w:color w:themeColor="accent1" w:val="4F81BD"/>
@@ -2255,7 +2410,7 @@
     <w:qFormat/>
     <w:rsid w:val="00fc693f"/>
     <w:rPr>
-      <w:rFonts w:ascii="Calibri" w:hAnsi="Calibri" w:eastAsia="ＭＳ ゴシック" w:cs="" w:asciiTheme="majorHAnsi" w:cstheme="majorBidi" w:eastAsiaTheme="majorEastAsia" w:hAnsiTheme="majorHAnsi"/>
+      <w:rFonts w:ascii="Calibri" w:hAnsi="Calibri" w:eastAsia="" w:cs="" w:asciiTheme="majorHAnsi" w:cstheme="majorBidi" w:eastAsiaTheme="majorEastAsia" w:hAnsiTheme="majorHAnsi"/>
       <w:b/>
       <w:bCs/>
       <w:color w:themeColor="accent1" w:val="4F81BD"/>
@@ -2269,7 +2424,7 @@
     <w:qFormat/>
     <w:rsid w:val="00fc693f"/>
     <w:rPr>
-      <w:rFonts w:ascii="Calibri" w:hAnsi="Calibri" w:eastAsia="ＭＳ ゴシック" w:cs="" w:asciiTheme="majorHAnsi" w:cstheme="majorBidi" w:eastAsiaTheme="majorEastAsia" w:hAnsiTheme="majorHAnsi"/>
+      <w:rFonts w:ascii="Calibri" w:hAnsi="Calibri" w:eastAsia="" w:cs="" w:asciiTheme="majorHAnsi" w:cstheme="majorBidi" w:eastAsiaTheme="majorEastAsia" w:hAnsiTheme="majorHAnsi"/>
       <w:color w:themeColor="text2" w:themeShade="bf" w:val="17365D"/>
       <w:spacing w:val="5"/>
       <w:kern w:val="2"/>
@@ -2285,7 +2440,7 @@
     <w:qFormat/>
     <w:rsid w:val="00fc693f"/>
     <w:rPr>
-      <w:rFonts w:ascii="Calibri" w:hAnsi="Calibri" w:eastAsia="ＭＳ ゴシック" w:cs="" w:asciiTheme="majorHAnsi" w:cstheme="majorBidi" w:eastAsiaTheme="majorEastAsia" w:hAnsiTheme="majorHAnsi"/>
+      <w:rFonts w:ascii="Calibri" w:hAnsi="Calibri" w:eastAsia="" w:cs="" w:asciiTheme="majorHAnsi" w:cstheme="majorBidi" w:eastAsiaTheme="majorEastAsia" w:hAnsiTheme="majorHAnsi"/>
       <w:i/>
       <w:iCs/>
       <w:color w:themeColor="accent1" w:val="4F81BD"/>
@@ -2358,7 +2513,7 @@
     <w:qFormat/>
     <w:rsid w:val="00fc693f"/>
     <w:rPr>
-      <w:rFonts w:ascii="Calibri" w:hAnsi="Calibri" w:eastAsia="ＭＳ ゴシック" w:cs="" w:asciiTheme="majorHAnsi" w:cstheme="majorBidi" w:eastAsiaTheme="majorEastAsia" w:hAnsiTheme="majorHAnsi"/>
+      <w:rFonts w:ascii="Calibri" w:hAnsi="Calibri" w:eastAsia="" w:cs="" w:asciiTheme="majorHAnsi" w:cstheme="majorBidi" w:eastAsiaTheme="majorEastAsia" w:hAnsiTheme="majorHAnsi"/>
       <w:b/>
       <w:bCs/>
       <w:i/>
@@ -2375,7 +2530,7 @@
     <w:qFormat/>
     <w:rsid w:val="00fc693f"/>
     <w:rPr>
-      <w:rFonts w:ascii="Calibri" w:hAnsi="Calibri" w:eastAsia="ＭＳ ゴシック" w:cs="" w:asciiTheme="majorHAnsi" w:cstheme="majorBidi" w:eastAsiaTheme="majorEastAsia" w:hAnsiTheme="majorHAnsi"/>
+      <w:rFonts w:ascii="Calibri" w:hAnsi="Calibri" w:eastAsia="" w:cs="" w:asciiTheme="majorHAnsi" w:cstheme="majorBidi" w:eastAsiaTheme="majorEastAsia" w:hAnsiTheme="majorHAnsi"/>
       <w:color w:themeColor="accent1" w:themeShade="7f" w:val="243F60"/>
     </w:rPr>
   </w:style>
@@ -2388,7 +2543,7 @@
     <w:qFormat/>
     <w:rsid w:val="00fc693f"/>
     <w:rPr>
-      <w:rFonts w:ascii="Calibri" w:hAnsi="Calibri" w:eastAsia="ＭＳ ゴシック" w:cs="" w:asciiTheme="majorHAnsi" w:cstheme="majorBidi" w:eastAsiaTheme="majorEastAsia" w:hAnsiTheme="majorHAnsi"/>
+      <w:rFonts w:ascii="Calibri" w:hAnsi="Calibri" w:eastAsia="" w:cs="" w:asciiTheme="majorHAnsi" w:cstheme="majorBidi" w:eastAsiaTheme="majorEastAsia" w:hAnsiTheme="majorHAnsi"/>
       <w:i/>
       <w:iCs/>
       <w:color w:themeColor="accent1" w:themeShade="7f" w:val="243F60"/>
@@ -2403,7 +2558,7 @@
     <w:qFormat/>
     <w:rsid w:val="00fc693f"/>
     <w:rPr>
-      <w:rFonts w:ascii="Calibri" w:hAnsi="Calibri" w:eastAsia="ＭＳ ゴシック" w:cs="" w:asciiTheme="majorHAnsi" w:cstheme="majorBidi" w:eastAsiaTheme="majorEastAsia" w:hAnsiTheme="majorHAnsi"/>
+      <w:rFonts w:ascii="Calibri" w:hAnsi="Calibri" w:eastAsia="" w:cs="" w:asciiTheme="majorHAnsi" w:cstheme="majorBidi" w:eastAsiaTheme="majorEastAsia" w:hAnsiTheme="majorHAnsi"/>
       <w:i/>
       <w:iCs/>
       <w:color w:themeColor="text1" w:themeTint="bf" w:val="404040"/>
@@ -2418,7 +2573,7 @@
     <w:qFormat/>
     <w:rsid w:val="00fc693f"/>
     <w:rPr>
-      <w:rFonts w:ascii="Calibri" w:hAnsi="Calibri" w:eastAsia="ＭＳ ゴシック" w:cs="" w:asciiTheme="majorHAnsi" w:cstheme="majorBidi" w:eastAsiaTheme="majorEastAsia" w:hAnsiTheme="majorHAnsi"/>
+      <w:rFonts w:ascii="Calibri" w:hAnsi="Calibri" w:eastAsia="" w:cs="" w:asciiTheme="majorHAnsi" w:cstheme="majorBidi" w:eastAsiaTheme="majorEastAsia" w:hAnsiTheme="majorHAnsi"/>
       <w:color w:themeColor="accent1" w:val="4F81BD"/>
       <w:sz w:val="20"/>
       <w:szCs w:val="20"/>
@@ -2433,7 +2588,7 @@
     <w:qFormat/>
     <w:rsid w:val="00fc693f"/>
     <w:rPr>
-      <w:rFonts w:ascii="Calibri" w:hAnsi="Calibri" w:eastAsia="ＭＳ ゴシック" w:cs="" w:asciiTheme="majorHAnsi" w:cstheme="majorBidi" w:eastAsiaTheme="majorEastAsia" w:hAnsiTheme="majorHAnsi"/>
+      <w:rFonts w:ascii="Calibri" w:hAnsi="Calibri" w:eastAsia="" w:cs="" w:asciiTheme="majorHAnsi" w:cstheme="majorBidi" w:eastAsiaTheme="majorEastAsia" w:hAnsiTheme="majorHAnsi"/>
       <w:i/>
       <w:iCs/>
       <w:color w:themeColor="text1" w:themeTint="bf" w:val="404040"/>
@@ -2663,12 +2818,13 @@
     <w:rsid w:val="00fc693f"/>
     <w:pPr>
       <w:widowControl/>
+      <w:suppressAutoHyphens w:val="true"/>
       <w:bidi w:val="0"/>
       <w:spacing w:lineRule="auto" w:line="240" w:before="0" w:after="0"/>
       <w:jc w:val="start"/>
     </w:pPr>
     <w:rPr>
-      <w:rFonts w:ascii="Cambria" w:hAnsi="Cambria" w:eastAsia="ＭＳ 明朝" w:cs="" w:asciiTheme="minorHAnsi" w:cstheme="minorBidi" w:eastAsiaTheme="minorEastAsia" w:hAnsiTheme="minorHAnsi"/>
+      <w:rFonts w:ascii="Cambria" w:hAnsi="Cambria" w:eastAsia="" w:cs="" w:asciiTheme="minorHAnsi" w:cstheme="minorBidi" w:eastAsiaTheme="minorEastAsia" w:hAnsiTheme="minorHAnsi"/>
       <w:color w:val="auto"/>
       <w:kern w:val="0"/>
       <w:sz w:val="22"/>
@@ -2692,7 +2848,7 @@
       <w:contextualSpacing/>
     </w:pPr>
     <w:rPr>
-      <w:rFonts w:ascii="Calibri" w:hAnsi="Calibri" w:eastAsia="ＭＳ ゴシック" w:cs="" w:asciiTheme="majorHAnsi" w:cstheme="majorBidi" w:eastAsiaTheme="majorEastAsia" w:hAnsiTheme="majorHAnsi"/>
+      <w:rFonts w:ascii="Calibri" w:hAnsi="Calibri" w:eastAsia="" w:cs="" w:asciiTheme="majorHAnsi" w:cstheme="majorBidi" w:eastAsiaTheme="majorEastAsia" w:hAnsiTheme="majorHAnsi"/>
       <w:color w:themeColor="text2" w:themeShade="bf" w:val="17365D"/>
       <w:spacing w:val="5"/>
       <w:kern w:val="2"/>
@@ -2710,7 +2866,7 @@
     <w:rsid w:val="00fc693f"/>
     <w:pPr/>
     <w:rPr>
-      <w:rFonts w:ascii="Calibri" w:hAnsi="Calibri" w:eastAsia="ＭＳ ゴシック" w:cs="" w:asciiTheme="majorHAnsi" w:cstheme="majorBidi" w:eastAsiaTheme="majorEastAsia" w:hAnsiTheme="majorHAnsi"/>
+      <w:rFonts w:ascii="Calibri" w:hAnsi="Calibri" w:eastAsia="" w:cs="" w:asciiTheme="majorHAnsi" w:cstheme="majorBidi" w:eastAsiaTheme="majorEastAsia" w:hAnsiTheme="majorHAnsi"/>
       <w:i/>
       <w:iCs/>
       <w:color w:themeColor="accent1" w:val="4F81BD"/>
@@ -2947,12 +3103,13 @@
         <w:tab w:val="left" w:pos="3456" w:leader="none"/>
         <w:tab w:val="left" w:pos="4032" w:leader="none"/>
       </w:tabs>
+      <w:suppressAutoHyphens w:val="true"/>
       <w:bidi w:val="0"/>
       <w:spacing w:lineRule="auto" w:line="276" w:before="0" w:after="200"/>
       <w:jc w:val="start"/>
     </w:pPr>
     <w:rPr>
-      <w:rFonts w:ascii="Courier" w:hAnsi="Courier" w:eastAsia="ＭＳ 明朝" w:cs="" w:cstheme="minorBidi" w:eastAsiaTheme="minorEastAsia"/>
+      <w:rFonts w:ascii="Courier" w:hAnsi="Courier" w:eastAsia="" w:cs="" w:cstheme="minorBidi" w:eastAsiaTheme="minorEastAsia"/>
       <w:color w:val="auto"/>
       <w:kern w:val="0"/>
       <w:sz w:val="20"/>
@@ -6173,7 +6330,6 @@
       <w:pPr>
         <w:spacing w:before="0" w:after="0" w:line="240" w:lineRule="auto"/>
       </w:pPr>
-      <w:rPr/>
       <w:tblPr/>
       <w:tcPr>
         <w:tcBorders>
@@ -6319,7 +6475,6 @@
       <w:pPr>
         <w:spacing w:before="0" w:after="0" w:line="240" w:lineRule="auto"/>
       </w:pPr>
-      <w:rPr/>
       <w:tblPr/>
       <w:tcPr>
         <w:tcBorders>
@@ -6465,7 +6620,6 @@
       <w:pPr>
         <w:spacing w:before="0" w:after="0" w:line="240" w:lineRule="auto"/>
       </w:pPr>
-      <w:rPr/>
       <w:tblPr/>
       <w:tcPr>
         <w:tcBorders>
@@ -6611,7 +6765,6 @@
       <w:pPr>
         <w:spacing w:before="0" w:after="0" w:line="240" w:lineRule="auto"/>
       </w:pPr>
-      <w:rPr/>
       <w:tblPr/>
       <w:tcPr>
         <w:tcBorders>
@@ -6757,7 +6910,6 @@
       <w:pPr>
         <w:spacing w:before="0" w:after="0" w:line="240" w:lineRule="auto"/>
       </w:pPr>
-      <w:rPr/>
       <w:tblPr/>
       <w:tcPr>
         <w:tcBorders>
@@ -6903,7 +7055,6 @@
       <w:pPr>
         <w:spacing w:before="0" w:after="0" w:line="240" w:lineRule="auto"/>
       </w:pPr>
-      <w:rPr/>
       <w:tblPr/>
       <w:tcPr>
         <w:tcBorders>
@@ -7049,7 +7200,6 @@
       <w:pPr>
         <w:spacing w:before="0" w:after="0" w:line="240" w:lineRule="auto"/>
       </w:pPr>
-      <w:rPr/>
       <w:tblPr/>
       <w:tcPr>
         <w:tcBorders>

</xml_diff>